<commit_message>
LaHaus base v06/10: proyeccion de viaje sin 'imaginate/aeropuerto' (descriptiva + pregunta de destino); base partida en 5 bloques de texto plano para las cargas manuales
</commit_message>
<xml_diff>
--- a/recursos/comercial/plataforma LaHaus/RESCATES_LEADS_2026-10-06.docx
+++ b/recursos/comercial/plataforma LaHaus/RESCATES_LEADS_2026-10-06.docx
@@ -26,7 +26,7 @@
           <w:color w:val="666666"/>
           <w:sz w:val="19"/>
         </w:rPr>
-        <w:t>Seis leads que el agente dejó ir entre el 3 y el 6 de octubre. Todos siguen calientes. Los teléfonos están en el encabezado de cada conversación en LaHaus. Regla: un solo mensaje, una sola propuesta (Fondo + cuotas + cita por videollamada o llamada), dos franjas. Si no responde en 2 horas, llamada. Nada presencial: no hay asesora en la sede.</w:t>
+        <w:t>Siete leads que el agente dejó ir entre el 3 y el 6 de octubre. Todos siguen calientes. Los teléfonos están en el encabezado de cada conversación en LaHaus. Regla: un solo mensaje, una sola propuesta (Fondo + cuotas + cita por videollamada o llamada), dos franjas. Si no responde en 2 horas, llamada. Nada presencial: no hay asesora en la sede.</w:t>
       </w:r>
     </w:p>
     <w:p>
@@ -157,6 +157,32 @@
           <w:sz w:val="21"/>
         </w:rPr>
         <w:t>Hola Jerson, soy María Eugenia de Heiiu. Como trabajas, te propongo la asesoría por videollamada para que entre también la persona con quien consultas sin desplazarse: hoy a las 6:30 pm o mañana a las 7:30 am. ¿Cuál les sirve? Te mando el enlace a este número. (Si ya eligió "mañana 11 en la sede": confirmarle que será por videollamada a esa misma hora.)</w:t>
+      </w:r>
+    </w:p>
+    <w:p>
+      <w:pPr>
+        <w:spacing w:before="200" w:after="80"/>
+      </w:pPr>
+      <w:r>
+        <w:rPr>
+          <w:b/>
+          <w:color w:val="E54C09"/>
+          <w:sz w:val="22"/>
+        </w:rPr>
+        <w:t>MARÍA EUGENIA — Alexandra Martínez · Tel: ______________ (tomar de LaHaus) · viaje · ella + hijo de 15 · solo tarde entre semana</w:t>
+      </w:r>
+    </w:p>
+    <w:p>
+      <w:pPr>
+        <w:spacing w:after="200"/>
+      </w:pPr>
+      <w:r>
+        <w:rPr>
+          <w:b w:val="0"/>
+          <w:i w:val="0"/>
+          <w:sz w:val="21"/>
+        </w:rPr>
+        <w:t>Hola Alexandra, soy María Eugenia de Heiiu. Leí tu conversación y te corrijo dos cosas: sí tenemos salones entre semana en la tarde y estamos abriendo grupo en esa franja, así que tú y tu hijo pueden estudiar juntos; y el valor para dos personas de la misma familia no es el de lista por dos: en la asesoría evaluamos la beca del Fondo para cada uno y un plan de cuotas conjunto. ¿Qué franja entre 1:30 y 6:00 pm les sirve a los dos? Y te propongo 20 minutos por videollamada hoy a las 6:30 o mañana a las 10 para armarles el plan.</w:t>
       </w:r>
     </w:p>
     <w:p>

</xml_diff>

<commit_message>
LaHaus: preguntas ya respondidas por el cliente no se repiten (base + punto 9 para Jaider)
</commit_message>
<xml_diff>
--- a/recursos/comercial/plataforma LaHaus/RESCATES_LEADS_2026-10-06.docx
+++ b/recursos/comercial/plataforma LaHaus/RESCATES_LEADS_2026-10-06.docx
@@ -12,7 +12,7 @@
           <w:color w:val="E54C09"/>
           <w:sz w:val="28"/>
         </w:rPr>
-        <w:t>RESCATES DE HOY — 06/10/2026</w:t>
+        <w:t>RESCATES — para enviar el martes 7/10 en la mañana (13 leads)</w:t>
       </w:r>
     </w:p>
     <w:p>
@@ -26,7 +26,7 @@
           <w:color w:val="666666"/>
           <w:sz w:val="19"/>
         </w:rPr>
-        <w:t>Siete leads que el agente dejó ir entre el 3 y el 6 de octubre. Todos siguen calientes. Los teléfonos están en el encabezado de cada conversación en LaHaus. Regla: un solo mensaje, una sola propuesta (Fondo + cuotas + cita por videollamada o llamada), dos franjas. Si no responde en 2 horas, llamada. Nada presencial: no hay asesora en la sede.</w:t>
+        <w:t>Trece leads que el agente dejó ir entre el 3 y el 6 de octubre. Orden: primero los seis con teléfono (Ivonne, Vanessa, Leine, Isa, Richard, Nathaly), que son los más calientes; después los siete del fin de semana, cuyo número se toma del encabezado de la conversación en LaHaus. Franjas escritas para enviar el martes 7 en la mañana; si se envían otro día, ajustar "hoy/mañana". Todos siguen calientes. Los teléfonos están en el encabezado de cada conversación en LaHaus. Regla: un solo mensaje, una sola propuesta (Fondo + cuotas + cita por videollamada o llamada), dos franjas. Si no responde en 2 horas, llamada. Nada presencial: no hay asesora en la sede.</w:t>
       </w:r>
     </w:p>
     <w:p>
@@ -183,6 +183,162 @@
           <w:sz w:val="21"/>
         </w:rPr>
         <w:t>Hola Alexandra, soy María Eugenia de Heiiu. Leí tu conversación y te corrijo dos cosas: sí tenemos salones entre semana en la tarde y estamos abriendo grupo en esa franja, así que tú y tu hijo pueden estudiar juntos; y el valor para dos personas de la misma familia no es el de lista por dos: en la asesoría evaluamos la beca del Fondo para cada uno y un plan de cuotas conjunto. ¿Qué franja entre 1:30 y 6:00 pm les sirve a los dos? Y te propongo 20 minutos por videollamada hoy a las 6:30 o mañana a las 10 para armarles el plan.</w:t>
+      </w:r>
+    </w:p>
+    <w:p>
+      <w:pPr>
+        <w:spacing w:before="200" w:after="80"/>
+      </w:pPr>
+      <w:r>
+        <w:rPr>
+          <w:b/>
+          <w:color w:val="E54C09"/>
+          <w:sz w:val="22"/>
+        </w:rPr>
+        <w:t>MARÍA EUGENIA — Isa Durango · Tel: 313 809 9965 · reactivación · noche · dijo "sí señora" a empezar y "yo iría" a la sede · nunca recibió hora confirmada</w:t>
+      </w:r>
+    </w:p>
+    <w:p>
+      <w:pPr>
+        <w:spacing w:after="200"/>
+      </w:pPr>
+      <w:r>
+        <w:rPr>
+          <w:b w:val="0"/>
+          <w:i w:val="0"/>
+          <w:sz w:val="21"/>
+        </w:rPr>
+        <w:t>Hola Isa, soy María Eugenia de Heiiu. Vi que quieres empezar y que la noche te sirve. Te confirmo tu asesoría de hoy a la 1:00 pm, por videollamada para que no tengas que desplazarte (la sede la conoces el primer día de clase). Te mando el enlace a este número 10 minutos antes. Si prefieres a las 3:30, también puedo. ¿Cuál te queda mejor?</w:t>
+      </w:r>
+    </w:p>
+    <w:p>
+      <w:pPr>
+        <w:spacing w:before="200" w:after="80"/>
+      </w:pPr>
+      <w:r>
+        <w:rPr>
+          <w:b/>
+          <w:color w:val="E54C09"/>
+          <w:sz w:val="22"/>
+        </w:rPr>
+        <w:t>MARÍA EUGENIA — Nathaly Nayitg · Tel: 320 397 2471 · formulario · estudiar fisioterapia afuera · desde cero · sin responder desde las 9:26 am → LLAMADA</w:t>
+      </w:r>
+    </w:p>
+    <w:p>
+      <w:pPr>
+        <w:spacing w:after="200"/>
+      </w:pPr>
+      <w:r>
+        <w:rPr>
+          <w:b w:val="0"/>
+          <w:i w:val="0"/>
+          <w:sz w:val="21"/>
+        </w:rPr>
+        <w:t>Guion de llamada: "Nathaly, buenas tardes, soy María Eugenia de Heiiu, la asistente te escribió esta mañana por lo del inglés para estudiar fisioterapia afuera. Te llamo solo para dejarte agendada la asesoría virtual de 20 minutos: ¿te sirve hoy a las 10:30 o a las 3:30? Ahí te explico el programa completo y la beca según tu perfil." Si no contesta: WhatsApp con las mismas dos franjas y segunda llamada mañana miércoles a las 9.</w:t>
+      </w:r>
+    </w:p>
+    <w:p>
+      <w:pPr>
+        <w:spacing w:before="200" w:after="80"/>
+      </w:pPr>
+      <w:r>
+        <w:rPr>
+          <w:b/>
+          <w:color w:val="E54C09"/>
+          <w:sz w:val="22"/>
+        </w:rPr>
+        <w:t>MARÍA EUGENIA — Leine Vargas · Tel: 301 438 8172 · reactivación · viaje · desde cero · noche · preguntó precio y mensualidad TRES veces</w:t>
+      </w:r>
+    </w:p>
+    <w:p>
+      <w:pPr>
+        <w:spacing w:after="200"/>
+      </w:pPr>
+      <w:r>
+        <w:rPr>
+          <w:b w:val="0"/>
+          <w:i w:val="0"/>
+          <w:sz w:val="21"/>
+        </w:rPr>
+        <w:t>Hola Leine, soy María Eugenia de Heiiu. Vi que preguntaste la mensualidad y la asistente no te la dio; te la doy yo. La cuota se arma con una inicial y mensualidades según la beca del Fondo que te corresponda, y es bastante menos de lo que sale dividiendo el valor en meses. En 20 minutos te muestro tu número exacto para la noche: ¿hoy a las 11:00 o a las 4:30 por videollamada?</w:t>
+      </w:r>
+    </w:p>
+    <w:p>
+      <w:pPr>
+        <w:spacing w:before="200" w:after="80"/>
+      </w:pPr>
+      <w:r>
+        <w:rPr>
+          <w:b/>
+          <w:color w:val="E54C09"/>
+          <w:sz w:val="22"/>
+        </w:rPr>
+        <w:t>MARÍA EUGENIA — Richard López (papá; hija de 16, estudia en las mañanas → sabatino o noche) · Tel: 316 483 7953 · preguntó "¿cuánto mensual?" → LLAMADA</w:t>
+      </w:r>
+    </w:p>
+    <w:p>
+      <w:pPr>
+        <w:spacing w:after="200"/>
+      </w:pPr>
+      <w:r>
+        <w:rPr>
+          <w:b w:val="0"/>
+          <w:i w:val="0"/>
+          <w:sz w:val="21"/>
+        </w:rPr>
+        <w:t>Guion de llamada: "Richard, buenas tardes, soy María Eugenia de Heiiu. La asistente no te dio la mensualidad para tu hija y te la doy yo: puede estudiar los sábados de 8 a 12, un nivel a la vez, o en la noche de 6:30 a 8:30 entre semana; ambas con inicial y cuotas. ¿Te queda bien 20 minutos por videollamada hoy a las 10 o a las 4 para mostrarte el número exacto y dejarle el cupo?"</w:t>
+      </w:r>
+    </w:p>
+    <w:p>
+      <w:pPr>
+        <w:spacing w:before="200" w:after="80"/>
+      </w:pPr>
+      <w:r>
+        <w:rPr>
+          <w:b/>
+          <w:color w:val="E54C09"/>
+          <w:sz w:val="22"/>
+        </w:rPr>
+        <w:t>MARÍA EUGENIA — Vanessa Castro · Tel: 315 705 2306 · formulario 5/10 + reactivación 6/10 (le reiniciaron el flujo) · noche · desde cero · preguntó precio y cómo se paga · WhatsApp y, si no responde en 30 min, LLAMADA</w:t>
+      </w:r>
+    </w:p>
+    <w:p>
+      <w:pPr>
+        <w:spacing w:after="200"/>
+      </w:pPr>
+      <w:r>
+        <w:rPr>
+          <w:b w:val="0"/>
+          <w:i w:val="0"/>
+          <w:sz w:val="21"/>
+        </w:rPr>
+        <w:t>Hola Vanessa, soy María Eugenia de Heiiu. Vi que quieres la noche, empiezas desde cero y preguntaste cómo se paga: te lo explico yo en 20 minutos con tu plan de cuotas (inicial más mensualidades, según la beca del Fondo que te corresponda). Por videollamada, para que no te desplaces: ¿hoy a las 11:00 o a las 4:30?</w:t>
+      </w:r>
+    </w:p>
+    <w:p>
+      <w:pPr>
+        <w:spacing w:before="200" w:after="80"/>
+      </w:pPr>
+      <w:r>
+        <w:rPr>
+          <w:b/>
+          <w:color w:val="E54C09"/>
+          <w:sz w:val="22"/>
+        </w:rPr>
+        <w:t>MARÍA EUGENIA — Ivonne (TRES personas: ella, esposo e hija de 25 que llega en 30 días) · Tel: 317 375 7435 · no puede los jueves · está fuera de la ciudad esta semana · dijo que iría a la sede → LLAMADA</w:t>
+      </w:r>
+    </w:p>
+    <w:p>
+      <w:pPr>
+        <w:spacing w:after="200"/>
+      </w:pPr>
+      <w:r>
+        <w:rPr>
+          <w:b w:val="0"/>
+          <w:i w:val="0"/>
+          <w:sz w:val="21"/>
+        </w:rPr>
+        <w:t>Guion de llamada: "Ivonne, buenas tardes, soy María Eugenia de Heiiu. Vi que quieren estudiar los tres, que tu hija llega en un mes y que los jueves no puedes. Para que no tengan que esperar a que vuelvas a la ciudad, les propongo la asesoría por videollamada esta semana, los tres si quieren: ¿hoy a las 6:30 pm o el jueves a las 10 am? Ahí les armo el plan para los tres con la beca del Fondo de cada uno y las cuotas, y les dejo los cupos apartados para cuando llegue tu hija."</w:t>
       </w:r>
     </w:p>
     <w:p>

</xml_diff>